<commit_message>
Struk gaji: Diterima Guru tanpa tunjangan, baris Kehadiran di identitas
Tunjangan (TuSehat + TuKerja) disetor sekolah langsung ke bank, jadi yang
dibawa guru = penerimaan bersih dikurangi tunjangan: baris "Tunjangan
disetor ke bank" sebelum Diterima Guru, dan penjelasannya di Catatan.
Blok identitas memuat ringkasan persentase kehadiran (mengajar, wali
kelas, piket) selain yang tercetak di tajuk tiap bagian. Contoh
Struk_Gaji.docx dibuat ulang.

Co-Authored-By: Claude Fable 5.1 <noreply@anthropic.com>
</commit_message>
<xml_diff>
--- a/dokumen/Struk_Gaji.docx
+++ b/dokumen/Struk_Gaji.docx
@@ -669,6 +669,107 @@
                 </w:p>
               </w:tc>
             </w:tr>
+            <w:tr>
+              <w:tc>
+                <w:tcPr>
+                  <w:tcW w:type="dxa" w:w="1300"/>
+                  <w:tcBorders>
+                    <w:top w:val="none" w:color="FFFFFF" w:sz="0"/>
+                    <w:left w:val="none" w:color="FFFFFF" w:sz="0"/>
+                    <w:bottom w:val="none" w:color="FFFFFF" w:sz="0"/>
+                    <w:right w:val="none" w:color="FFFFFF" w:sz="0"/>
+                  </w:tcBorders>
+                  <w:tcMar>
+                    <w:top w:type="dxa" w:w="14"/>
+                    <w:left w:type="dxa" w:w="60"/>
+                    <w:bottom w:type="dxa" w:w="14"/>
+                    <w:right w:type="dxa" w:w="60"/>
+                  </w:tcMar>
+                  <w:vAlign w:val="center"/>
+                </w:tcPr>
+                <w:p>
+                  <w:pPr>
+                    <w:spacing w:after="0" w:before="0" w:line="216"/>
+                    <w:jc w:val="left"/>
+                  </w:pPr>
+                  <w:r>
+                    <w:rPr>
+                      <w:rFonts w:ascii="Calibri" w:cs="Calibri" w:eastAsia="Calibri" w:hAnsi="Calibri"/>
+                      <w:sz w:val="16"/>
+                      <w:szCs w:val="16"/>
+                    </w:rPr>
+                    <w:t xml:space="preserve">Kehadiran</w:t>
+                  </w:r>
+                </w:p>
+              </w:tc>
+              <w:tc>
+                <w:tcPr>
+                  <w:tcW w:type="dxa" w:w="200"/>
+                  <w:tcBorders>
+                    <w:top w:val="none" w:color="FFFFFF" w:sz="0"/>
+                    <w:left w:val="none" w:color="FFFFFF" w:sz="0"/>
+                    <w:bottom w:val="none" w:color="FFFFFF" w:sz="0"/>
+                    <w:right w:val="none" w:color="FFFFFF" w:sz="0"/>
+                  </w:tcBorders>
+                  <w:tcMar>
+                    <w:top w:type="dxa" w:w="14"/>
+                    <w:left w:type="dxa" w:w="60"/>
+                    <w:bottom w:type="dxa" w:w="14"/>
+                    <w:right w:type="dxa" w:w="60"/>
+                  </w:tcMar>
+                  <w:vAlign w:val="center"/>
+                </w:tcPr>
+                <w:p>
+                  <w:pPr>
+                    <w:spacing w:after="0" w:before="0" w:line="216"/>
+                    <w:jc w:val="left"/>
+                  </w:pPr>
+                  <w:r>
+                    <w:rPr>
+                      <w:rFonts w:ascii="Calibri" w:cs="Calibri" w:eastAsia="Calibri" w:hAnsi="Calibri"/>
+                      <w:sz w:val="16"/>
+                      <w:szCs w:val="16"/>
+                    </w:rPr>
+                    <w:t xml:space="preserve">:</w:t>
+                  </w:r>
+                </w:p>
+              </w:tc>
+              <w:tc>
+                <w:tcPr>
+                  <w:tcW w:type="dxa" w:w="6000"/>
+                  <w:gridSpan w:val="4"/>
+                  <w:tcBorders>
+                    <w:top w:val="none" w:color="FFFFFF" w:sz="0"/>
+                    <w:left w:val="none" w:color="FFFFFF" w:sz="0"/>
+                    <w:bottom w:val="none" w:color="FFFFFF" w:sz="0"/>
+                    <w:right w:val="none" w:color="FFFFFF" w:sz="0"/>
+                  </w:tcBorders>
+                  <w:tcMar>
+                    <w:top w:type="dxa" w:w="14"/>
+                    <w:left w:type="dxa" w:w="60"/>
+                    <w:bottom w:type="dxa" w:w="14"/>
+                    <w:right w:type="dxa" w:w="60"/>
+                  </w:tcMar>
+                  <w:vAlign w:val="center"/>
+                </w:tcPr>
+                <w:p>
+                  <w:pPr>
+                    <w:spacing w:after="0" w:before="0" w:line="216"/>
+                    <w:jc w:val="left"/>
+                  </w:pPr>
+                  <w:r>
+                    <w:rPr>
+                      <w:rFonts w:ascii="Calibri" w:cs="Calibri" w:eastAsia="Calibri" w:hAnsi="Calibri"/>
+                      <w:b/>
+                      <w:bCs/>
+                      <w:sz w:val="16"/>
+                      <w:szCs w:val="16"/>
+                    </w:rPr>
+                    <w:t xml:space="preserve">Mengajar 95,25% · Wali kelas 87,50% · Piket unit 100,00% · Piket meja 80,00%</w:t>
+                  </w:r>
+                </w:p>
+              </w:tc>
+            </w:tr>
           </w:tbl>
           <w:p>
             <w:pPr>
@@ -5810,6 +5911,182 @@
                     <w:bottom w:val="none" w:color="FFFFFF" w:sz="0"/>
                     <w:right w:val="none" w:color="FFFFFF" w:sz="0"/>
                   </w:tcBorders>
+                  <w:tcMar>
+                    <w:top w:type="dxa" w:w="14"/>
+                    <w:left w:type="dxa" w:w="60"/>
+                    <w:bottom w:type="dxa" w:w="14"/>
+                    <w:right w:type="dxa" w:w="60"/>
+                  </w:tcMar>
+                  <w:vAlign w:val="center"/>
+                </w:tcPr>
+                <w:p>
+                  <w:pPr>
+                    <w:spacing w:after="0" w:before="0" w:line="216"/>
+                    <w:jc w:val="right"/>
+                  </w:pPr>
+                  <w:r>
+                    <w:rPr>
+                      <w:rFonts w:ascii="Calibri" w:cs="Calibri" w:eastAsia="Calibri" w:hAnsi="Calibri"/>
+                      <w:sz w:val="16"/>
+                      <w:szCs w:val="16"/>
+                    </w:rPr>
+                    <w:t xml:space="preserve"/>
+                  </w:r>
+                </w:p>
+              </w:tc>
+              <w:tc>
+                <w:tcPr>
+                  <w:tcW w:type="dxa" w:w="2900"/>
+                  <w:tcBorders>
+                    <w:top w:val="none" w:color="FFFFFF" w:sz="0"/>
+                    <w:left w:val="none" w:color="FFFFFF" w:sz="0"/>
+                    <w:bottom w:val="none" w:color="FFFFFF" w:sz="0"/>
+                    <w:right w:val="none" w:color="FFFFFF" w:sz="0"/>
+                  </w:tcBorders>
+                  <w:tcMar>
+                    <w:top w:type="dxa" w:w="14"/>
+                    <w:left w:type="dxa" w:w="60"/>
+                    <w:bottom w:type="dxa" w:w="14"/>
+                    <w:right w:type="dxa" w:w="60"/>
+                  </w:tcMar>
+                  <w:vAlign w:val="center"/>
+                </w:tcPr>
+                <w:p>
+                  <w:pPr>
+                    <w:spacing w:after="0" w:before="0" w:line="216"/>
+                    <w:jc w:val="left"/>
+                  </w:pPr>
+                  <w:r>
+                    <w:rPr>
+                      <w:rFonts w:ascii="Calibri" w:cs="Calibri" w:eastAsia="Calibri" w:hAnsi="Calibri"/>
+                      <w:sz w:val="16"/>
+                      <w:szCs w:val="16"/>
+                    </w:rPr>
+                    <w:t xml:space="preserve">Tunjangan disetor ke bank</w:t>
+                  </w:r>
+                </w:p>
+              </w:tc>
+              <w:tc>
+                <w:tcPr>
+                  <w:tcW w:type="dxa" w:w="2340"/>
+                  <w:tcBorders>
+                    <w:top w:val="none" w:color="FFFFFF" w:sz="0"/>
+                    <w:left w:val="none" w:color="FFFFFF" w:sz="0"/>
+                    <w:bottom w:val="none" w:color="FFFFFF" w:sz="0"/>
+                    <w:right w:val="none" w:color="FFFFFF" w:sz="0"/>
+                  </w:tcBorders>
+                  <w:tcMar>
+                    <w:top w:type="dxa" w:w="14"/>
+                    <w:left w:type="dxa" w:w="60"/>
+                    <w:bottom w:type="dxa" w:w="14"/>
+                    <w:right w:type="dxa" w:w="60"/>
+                  </w:tcMar>
+                  <w:vAlign w:val="center"/>
+                </w:tcPr>
+                <w:p>
+                  <w:pPr>
+                    <w:spacing w:after="0" w:before="0" w:line="216"/>
+                    <w:jc w:val="left"/>
+                  </w:pPr>
+                  <w:r>
+                    <w:rPr>
+                      <w:rFonts w:ascii="Calibri" w:cs="Calibri" w:eastAsia="Calibri" w:hAnsi="Calibri"/>
+                      <w:i/>
+                      <w:iCs/>
+                      <w:color w:val="595959"/>
+                      <w:sz w:val="16"/>
+                      <w:szCs w:val="16"/>
+                    </w:rPr>
+                    <w:t xml:space="preserve">TuSehat &amp; TuKerja, tidak diterima tunai</w:t>
+                  </w:r>
+                  <w:r>
+                    <w:rPr>
+                      <w:rFonts w:ascii="Calibri" w:cs="Calibri" w:eastAsia="Calibri" w:hAnsi="Calibri"/>
+                      <w:i/>
+                      <w:iCs/>
+                      <w:color w:val="595959"/>
+                      <w:sz w:val="16"/>
+                      <w:szCs w:val="16"/>
+                    </w:rPr>
+                    <w:t xml:space="preserve"> </w:t>
+                  </w:r>
+                </w:p>
+              </w:tc>
+              <w:tc>
+                <w:tcPr>
+                  <w:tcW w:type="dxa" w:w="400"/>
+                  <w:tcBorders>
+                    <w:top w:val="none" w:color="FFFFFF" w:sz="0"/>
+                    <w:left w:val="none" w:color="FFFFFF" w:sz="0"/>
+                    <w:bottom w:val="none" w:color="FFFFFF" w:sz="0"/>
+                    <w:right w:val="none" w:color="FFFFFF" w:sz="0"/>
+                  </w:tcBorders>
+                  <w:tcMar>
+                    <w:top w:type="dxa" w:w="14"/>
+                    <w:left w:type="dxa" w:w="60"/>
+                    <w:bottom w:type="dxa" w:w="14"/>
+                    <w:right w:type="dxa" w:w="60"/>
+                  </w:tcMar>
+                  <w:vAlign w:val="center"/>
+                </w:tcPr>
+                <w:p>
+                  <w:pPr>
+                    <w:spacing w:after="0" w:before="0" w:line="216"/>
+                    <w:jc w:val="left"/>
+                  </w:pPr>
+                  <w:r>
+                    <w:rPr>
+                      <w:rFonts w:ascii="Calibri" w:cs="Calibri" w:eastAsia="Calibri" w:hAnsi="Calibri"/>
+                      <w:sz w:val="16"/>
+                      <w:szCs w:val="16"/>
+                    </w:rPr>
+                    <w:t xml:space="preserve">Rp</w:t>
+                  </w:r>
+                </w:p>
+              </w:tc>
+              <w:tc>
+                <w:tcPr>
+                  <w:tcW w:type="dxa" w:w="1500"/>
+                  <w:tcBorders>
+                    <w:top w:val="none" w:color="FFFFFF" w:sz="0"/>
+                    <w:left w:val="none" w:color="FFFFFF" w:sz="0"/>
+                    <w:bottom w:val="none" w:color="FFFFFF" w:sz="0"/>
+                    <w:right w:val="none" w:color="FFFFFF" w:sz="0"/>
+                  </w:tcBorders>
+                  <w:tcMar>
+                    <w:top w:type="dxa" w:w="14"/>
+                    <w:left w:type="dxa" w:w="60"/>
+                    <w:bottom w:type="dxa" w:w="14"/>
+                    <w:right w:type="dxa" w:w="60"/>
+                  </w:tcMar>
+                  <w:vAlign w:val="center"/>
+                </w:tcPr>
+                <w:p>
+                  <w:pPr>
+                    <w:spacing w:after="0" w:before="0" w:line="216"/>
+                    <w:jc w:val="right"/>
+                  </w:pPr>
+                  <w:r>
+                    <w:rPr>
+                      <w:rFonts w:ascii="Calibri" w:cs="Calibri" w:eastAsia="Calibri" w:hAnsi="Calibri"/>
+                      <w:sz w:val="16"/>
+                      <w:szCs w:val="16"/>
+                    </w:rPr>
+                    <w:t xml:space="preserve">250.000</w:t>
+                  </w:r>
+                </w:p>
+              </w:tc>
+            </w:tr>
+            <w:tr>
+              <w:tc>
+                <w:tcPr>
+                  <w:tcW w:type="dxa" w:w="360"/>
+                  <w:tcBorders>
+                    <w:top w:val="none" w:color="FFFFFF" w:sz="0"/>
+                    <w:left w:val="none" w:color="FFFFFF" w:sz="0"/>
+                    <w:bottom w:val="none" w:color="FFFFFF" w:sz="0"/>
+                    <w:right w:val="none" w:color="FFFFFF" w:sz="0"/>
+                  </w:tcBorders>
                   <w:shd w:fill="E2EFDA" w:color="auto" w:val="clear"/>
                   <w:tcMar>
                     <w:top w:type="dxa" w:w="40"/>
@@ -5867,7 +6144,7 @@
                       <w:sz w:val="18"/>
                       <w:szCs w:val="18"/>
                     </w:rPr>
-                    <w:t xml:space="preserve">PENERIMAAN BERSIH</w:t>
+                    <w:t xml:space="preserve">DITERIMA GURU</w:t>
                   </w:r>
                 </w:p>
               </w:tc>
@@ -5939,7 +6216,7 @@
                       <w:sz w:val="18"/>
                       <w:szCs w:val="18"/>
                     </w:rPr>
-                    <w:t xml:space="preserve">4.061.500</w:t>
+                    <w:t xml:space="preserve">3.811.500</w:t>
                   </w:r>
                 </w:p>
               </w:tc>
@@ -6009,7 +6286,7 @@
                       <w:sz w:val="16"/>
                       <w:szCs w:val="16"/>
                     </w:rPr>
-                    <w:t xml:space="preserve">Terbilang: Empat juta enam puluh satu ribu lima ratus rupiah</w:t>
+                    <w:t xml:space="preserve">Terbilang: Tiga juta delapan ratus sebelas ribu lima ratus rupiah</w:t>
                   </w:r>
                 </w:p>
               </w:tc>
@@ -6080,6 +6357,21 @@
                       <w:szCs w:val="14"/>
                     </w:rPr>
                     <w:t xml:space="preserve">Catatan:</w:t>
+                  </w:r>
+                </w:p>
+                <w:p>
+                  <w:pPr>
+                    <w:spacing w:after="0" w:before="0" w:line="216"/>
+                    <w:jc w:val="left"/>
+                  </w:pPr>
+                  <w:r>
+                    <w:rPr>
+                      <w:rFonts w:ascii="Calibri" w:cs="Calibri" w:eastAsia="Calibri" w:hAnsi="Calibri"/>
+                      <w:color w:val="595959"/>
+                      <w:sz w:val="14"/>
+                      <w:szCs w:val="14"/>
+                    </w:rPr>
+                    <w:t xml:space="preserve">Tunjangan Kesehatan dan Ketenagakerjaan sebesar Rp 250.000 disetor langsung ke bank / penyelenggara oleh sekolah, tidak termasuk jumlah yang diterima.</w:t>
                   </w:r>
                 </w:p>
                 <w:p>
@@ -6962,6 +7254,107 @@
                 </w:p>
               </w:tc>
             </w:tr>
+            <w:tr>
+              <w:tc>
+                <w:tcPr>
+                  <w:tcW w:type="dxa" w:w="1300"/>
+                  <w:tcBorders>
+                    <w:top w:val="none" w:color="FFFFFF" w:sz="0"/>
+                    <w:left w:val="none" w:color="FFFFFF" w:sz="0"/>
+                    <w:bottom w:val="none" w:color="FFFFFF" w:sz="0"/>
+                    <w:right w:val="none" w:color="FFFFFF" w:sz="0"/>
+                  </w:tcBorders>
+                  <w:tcMar>
+                    <w:top w:type="dxa" w:w="14"/>
+                    <w:left w:type="dxa" w:w="60"/>
+                    <w:bottom w:type="dxa" w:w="14"/>
+                    <w:right w:type="dxa" w:w="60"/>
+                  </w:tcMar>
+                  <w:vAlign w:val="center"/>
+                </w:tcPr>
+                <w:p>
+                  <w:pPr>
+                    <w:spacing w:after="0" w:before="0" w:line="216"/>
+                    <w:jc w:val="left"/>
+                  </w:pPr>
+                  <w:r>
+                    <w:rPr>
+                      <w:rFonts w:ascii="Calibri" w:cs="Calibri" w:eastAsia="Calibri" w:hAnsi="Calibri"/>
+                      <w:sz w:val="16"/>
+                      <w:szCs w:val="16"/>
+                    </w:rPr>
+                    <w:t xml:space="preserve">Kehadiran</w:t>
+                  </w:r>
+                </w:p>
+              </w:tc>
+              <w:tc>
+                <w:tcPr>
+                  <w:tcW w:type="dxa" w:w="200"/>
+                  <w:tcBorders>
+                    <w:top w:val="none" w:color="FFFFFF" w:sz="0"/>
+                    <w:left w:val="none" w:color="FFFFFF" w:sz="0"/>
+                    <w:bottom w:val="none" w:color="FFFFFF" w:sz="0"/>
+                    <w:right w:val="none" w:color="FFFFFF" w:sz="0"/>
+                  </w:tcBorders>
+                  <w:tcMar>
+                    <w:top w:type="dxa" w:w="14"/>
+                    <w:left w:type="dxa" w:w="60"/>
+                    <w:bottom w:type="dxa" w:w="14"/>
+                    <w:right w:type="dxa" w:w="60"/>
+                  </w:tcMar>
+                  <w:vAlign w:val="center"/>
+                </w:tcPr>
+                <w:p>
+                  <w:pPr>
+                    <w:spacing w:after="0" w:before="0" w:line="216"/>
+                    <w:jc w:val="left"/>
+                  </w:pPr>
+                  <w:r>
+                    <w:rPr>
+                      <w:rFonts w:ascii="Calibri" w:cs="Calibri" w:eastAsia="Calibri" w:hAnsi="Calibri"/>
+                      <w:sz w:val="16"/>
+                      <w:szCs w:val="16"/>
+                    </w:rPr>
+                    <w:t xml:space="preserve">:</w:t>
+                  </w:r>
+                </w:p>
+              </w:tc>
+              <w:tc>
+                <w:tcPr>
+                  <w:tcW w:type="dxa" w:w="6000"/>
+                  <w:gridSpan w:val="4"/>
+                  <w:tcBorders>
+                    <w:top w:val="none" w:color="FFFFFF" w:sz="0"/>
+                    <w:left w:val="none" w:color="FFFFFF" w:sz="0"/>
+                    <w:bottom w:val="none" w:color="FFFFFF" w:sz="0"/>
+                    <w:right w:val="none" w:color="FFFFFF" w:sz="0"/>
+                  </w:tcBorders>
+                  <w:tcMar>
+                    <w:top w:type="dxa" w:w="14"/>
+                    <w:left w:type="dxa" w:w="60"/>
+                    <w:bottom w:type="dxa" w:w="14"/>
+                    <w:right w:type="dxa" w:w="60"/>
+                  </w:tcMar>
+                  <w:vAlign w:val="center"/>
+                </w:tcPr>
+                <w:p>
+                  <w:pPr>
+                    <w:spacing w:after="0" w:before="0" w:line="216"/>
+                    <w:jc w:val="left"/>
+                  </w:pPr>
+                  <w:r>
+                    <w:rPr>
+                      <w:rFonts w:ascii="Calibri" w:cs="Calibri" w:eastAsia="Calibri" w:hAnsi="Calibri"/>
+                      <w:b/>
+                      <w:bCs/>
+                      <w:sz w:val="16"/>
+                      <w:szCs w:val="16"/>
+                    </w:rPr>
+                    <w:t xml:space="preserve">Mengajar 92,73% · Wali kelas 100,00% · Piket meja 75,00%</w:t>
+                  </w:r>
+                </w:p>
+              </w:tc>
+            </w:tr>
           </w:tbl>
           <w:p>
             <w:pPr>
@@ -12049,6 +12442,182 @@
                     <w:bottom w:val="none" w:color="FFFFFF" w:sz="0"/>
                     <w:right w:val="none" w:color="FFFFFF" w:sz="0"/>
                   </w:tcBorders>
+                  <w:tcMar>
+                    <w:top w:type="dxa" w:w="14"/>
+                    <w:left w:type="dxa" w:w="60"/>
+                    <w:bottom w:type="dxa" w:w="14"/>
+                    <w:right w:type="dxa" w:w="60"/>
+                  </w:tcMar>
+                  <w:vAlign w:val="center"/>
+                </w:tcPr>
+                <w:p>
+                  <w:pPr>
+                    <w:spacing w:after="0" w:before="0" w:line="216"/>
+                    <w:jc w:val="right"/>
+                  </w:pPr>
+                  <w:r>
+                    <w:rPr>
+                      <w:rFonts w:ascii="Calibri" w:cs="Calibri" w:eastAsia="Calibri" w:hAnsi="Calibri"/>
+                      <w:sz w:val="16"/>
+                      <w:szCs w:val="16"/>
+                    </w:rPr>
+                    <w:t xml:space="preserve"/>
+                  </w:r>
+                </w:p>
+              </w:tc>
+              <w:tc>
+                <w:tcPr>
+                  <w:tcW w:type="dxa" w:w="2900"/>
+                  <w:tcBorders>
+                    <w:top w:val="none" w:color="FFFFFF" w:sz="0"/>
+                    <w:left w:val="none" w:color="FFFFFF" w:sz="0"/>
+                    <w:bottom w:val="none" w:color="FFFFFF" w:sz="0"/>
+                    <w:right w:val="none" w:color="FFFFFF" w:sz="0"/>
+                  </w:tcBorders>
+                  <w:tcMar>
+                    <w:top w:type="dxa" w:w="14"/>
+                    <w:left w:type="dxa" w:w="60"/>
+                    <w:bottom w:type="dxa" w:w="14"/>
+                    <w:right w:type="dxa" w:w="60"/>
+                  </w:tcMar>
+                  <w:vAlign w:val="center"/>
+                </w:tcPr>
+                <w:p>
+                  <w:pPr>
+                    <w:spacing w:after="0" w:before="0" w:line="216"/>
+                    <w:jc w:val="left"/>
+                  </w:pPr>
+                  <w:r>
+                    <w:rPr>
+                      <w:rFonts w:ascii="Calibri" w:cs="Calibri" w:eastAsia="Calibri" w:hAnsi="Calibri"/>
+                      <w:sz w:val="16"/>
+                      <w:szCs w:val="16"/>
+                    </w:rPr>
+                    <w:t xml:space="preserve">Tunjangan disetor ke bank</w:t>
+                  </w:r>
+                </w:p>
+              </w:tc>
+              <w:tc>
+                <w:tcPr>
+                  <w:tcW w:type="dxa" w:w="2340"/>
+                  <w:tcBorders>
+                    <w:top w:val="none" w:color="FFFFFF" w:sz="0"/>
+                    <w:left w:val="none" w:color="FFFFFF" w:sz="0"/>
+                    <w:bottom w:val="none" w:color="FFFFFF" w:sz="0"/>
+                    <w:right w:val="none" w:color="FFFFFF" w:sz="0"/>
+                  </w:tcBorders>
+                  <w:tcMar>
+                    <w:top w:type="dxa" w:w="14"/>
+                    <w:left w:type="dxa" w:w="60"/>
+                    <w:bottom w:type="dxa" w:w="14"/>
+                    <w:right w:type="dxa" w:w="60"/>
+                  </w:tcMar>
+                  <w:vAlign w:val="center"/>
+                </w:tcPr>
+                <w:p>
+                  <w:pPr>
+                    <w:spacing w:after="0" w:before="0" w:line="216"/>
+                    <w:jc w:val="left"/>
+                  </w:pPr>
+                  <w:r>
+                    <w:rPr>
+                      <w:rFonts w:ascii="Calibri" w:cs="Calibri" w:eastAsia="Calibri" w:hAnsi="Calibri"/>
+                      <w:i/>
+                      <w:iCs/>
+                      <w:color w:val="595959"/>
+                      <w:sz w:val="16"/>
+                      <w:szCs w:val="16"/>
+                    </w:rPr>
+                    <w:t xml:space="preserve">TuSehat &amp; TuKerja, tidak diterima tunai</w:t>
+                  </w:r>
+                  <w:r>
+                    <w:rPr>
+                      <w:rFonts w:ascii="Calibri" w:cs="Calibri" w:eastAsia="Calibri" w:hAnsi="Calibri"/>
+                      <w:i/>
+                      <w:iCs/>
+                      <w:color w:val="595959"/>
+                      <w:sz w:val="16"/>
+                      <w:szCs w:val="16"/>
+                    </w:rPr>
+                    <w:t xml:space="preserve"> </w:t>
+                  </w:r>
+                </w:p>
+              </w:tc>
+              <w:tc>
+                <w:tcPr>
+                  <w:tcW w:type="dxa" w:w="400"/>
+                  <w:tcBorders>
+                    <w:top w:val="none" w:color="FFFFFF" w:sz="0"/>
+                    <w:left w:val="none" w:color="FFFFFF" w:sz="0"/>
+                    <w:bottom w:val="none" w:color="FFFFFF" w:sz="0"/>
+                    <w:right w:val="none" w:color="FFFFFF" w:sz="0"/>
+                  </w:tcBorders>
+                  <w:tcMar>
+                    <w:top w:type="dxa" w:w="14"/>
+                    <w:left w:type="dxa" w:w="60"/>
+                    <w:bottom w:type="dxa" w:w="14"/>
+                    <w:right w:type="dxa" w:w="60"/>
+                  </w:tcMar>
+                  <w:vAlign w:val="center"/>
+                </w:tcPr>
+                <w:p>
+                  <w:pPr>
+                    <w:spacing w:after="0" w:before="0" w:line="216"/>
+                    <w:jc w:val="left"/>
+                  </w:pPr>
+                  <w:r>
+                    <w:rPr>
+                      <w:rFonts w:ascii="Calibri" w:cs="Calibri" w:eastAsia="Calibri" w:hAnsi="Calibri"/>
+                      <w:sz w:val="16"/>
+                      <w:szCs w:val="16"/>
+                    </w:rPr>
+                    <w:t xml:space="preserve">Rp</w:t>
+                  </w:r>
+                </w:p>
+              </w:tc>
+              <w:tc>
+                <w:tcPr>
+                  <w:tcW w:type="dxa" w:w="1500"/>
+                  <w:tcBorders>
+                    <w:top w:val="none" w:color="FFFFFF" w:sz="0"/>
+                    <w:left w:val="none" w:color="FFFFFF" w:sz="0"/>
+                    <w:bottom w:val="none" w:color="FFFFFF" w:sz="0"/>
+                    <w:right w:val="none" w:color="FFFFFF" w:sz="0"/>
+                  </w:tcBorders>
+                  <w:tcMar>
+                    <w:top w:type="dxa" w:w="14"/>
+                    <w:left w:type="dxa" w:w="60"/>
+                    <w:bottom w:type="dxa" w:w="14"/>
+                    <w:right w:type="dxa" w:w="60"/>
+                  </w:tcMar>
+                  <w:vAlign w:val="center"/>
+                </w:tcPr>
+                <w:p>
+                  <w:pPr>
+                    <w:spacing w:after="0" w:before="0" w:line="216"/>
+                    <w:jc w:val="right"/>
+                  </w:pPr>
+                  <w:r>
+                    <w:rPr>
+                      <w:rFonts w:ascii="Calibri" w:cs="Calibri" w:eastAsia="Calibri" w:hAnsi="Calibri"/>
+                      <w:sz w:val="16"/>
+                      <w:szCs w:val="16"/>
+                    </w:rPr>
+                    <w:t xml:space="preserve">250.000</w:t>
+                  </w:r>
+                </w:p>
+              </w:tc>
+            </w:tr>
+            <w:tr>
+              <w:tc>
+                <w:tcPr>
+                  <w:tcW w:type="dxa" w:w="360"/>
+                  <w:tcBorders>
+                    <w:top w:val="none" w:color="FFFFFF" w:sz="0"/>
+                    <w:left w:val="none" w:color="FFFFFF" w:sz="0"/>
+                    <w:bottom w:val="none" w:color="FFFFFF" w:sz="0"/>
+                    <w:right w:val="none" w:color="FFFFFF" w:sz="0"/>
+                  </w:tcBorders>
                   <w:shd w:fill="E2EFDA" w:color="auto" w:val="clear"/>
                   <w:tcMar>
                     <w:top w:type="dxa" w:w="40"/>
@@ -12106,7 +12675,7 @@
                       <w:sz w:val="18"/>
                       <w:szCs w:val="18"/>
                     </w:rPr>
-                    <w:t xml:space="preserve">PENERIMAAN BERSIH</w:t>
+                    <w:t xml:space="preserve">DITERIMA GURU</w:t>
                   </w:r>
                 </w:p>
               </w:tc>
@@ -12178,7 +12747,7 @@
                       <w:sz w:val="18"/>
                       <w:szCs w:val="18"/>
                     </w:rPr>
-                    <w:t xml:space="preserve">3.224.500</w:t>
+                    <w:t xml:space="preserve">2.974.500</w:t>
                   </w:r>
                 </w:p>
               </w:tc>
@@ -12248,7 +12817,7 @@
                       <w:sz w:val="16"/>
                       <w:szCs w:val="16"/>
                     </w:rPr>
-                    <w:t xml:space="preserve">Terbilang: Tiga juta dua ratus dua puluh empat ribu lima ratus rupiah</w:t>
+                    <w:t xml:space="preserve">Terbilang: Dua juta sembilan ratus tujuh puluh empat ribu lima ratus rupiah</w:t>
                   </w:r>
                 </w:p>
               </w:tc>
@@ -12319,6 +12888,21 @@
                       <w:szCs w:val="14"/>
                     </w:rPr>
                     <w:t xml:space="preserve">Catatan:</w:t>
+                  </w:r>
+                </w:p>
+                <w:p>
+                  <w:pPr>
+                    <w:spacing w:after="0" w:before="0" w:line="216"/>
+                    <w:jc w:val="left"/>
+                  </w:pPr>
+                  <w:r>
+                    <w:rPr>
+                      <w:rFonts w:ascii="Calibri" w:cs="Calibri" w:eastAsia="Calibri" w:hAnsi="Calibri"/>
+                      <w:color w:val="595959"/>
+                      <w:sz w:val="14"/>
+                      <w:szCs w:val="14"/>
+                    </w:rPr>
+                    <w:t xml:space="preserve">Tunjangan Kesehatan dan Ketenagakerjaan sebesar Rp 250.000 disetor langsung ke bank / penyelenggara oleh sekolah, tidak termasuk jumlah yang diterima.</w:t>
                   </w:r>
                 </w:p>
                 <w:p>

</xml_diff>

<commit_message>
Struk gaji: label "Diterima Tunai oleh Guru", catatan satu kalimat
Co-Authored-By: Claude Fable 5.1 <noreply@anthropic.com>
</commit_message>
<xml_diff>
--- a/dokumen/Struk_Gaji.docx
+++ b/dokumen/Struk_Gaji.docx
@@ -6144,7 +6144,7 @@
                       <w:sz w:val="18"/>
                       <w:szCs w:val="18"/>
                     </w:rPr>
-                    <w:t xml:space="preserve">DITERIMA GURU</w:t>
+                    <w:t xml:space="preserve">DITERIMA TUNAI OLEH GURU</w:t>
                   </w:r>
                 </w:p>
               </w:tc>
@@ -6357,21 +6357,6 @@
                       <w:szCs w:val="14"/>
                     </w:rPr>
                     <w:t xml:space="preserve">Catatan:</w:t>
-                  </w:r>
-                </w:p>
-                <w:p>
-                  <w:pPr>
-                    <w:spacing w:after="0" w:before="0" w:line="216"/>
-                    <w:jc w:val="left"/>
-                  </w:pPr>
-                  <w:r>
-                    <w:rPr>
-                      <w:rFonts w:ascii="Calibri" w:cs="Calibri" w:eastAsia="Calibri" w:hAnsi="Calibri"/>
-                      <w:color w:val="595959"/>
-                      <w:sz w:val="14"/>
-                      <w:szCs w:val="14"/>
-                    </w:rPr>
-                    <w:t xml:space="preserve">Tunjangan Kesehatan dan Ketenagakerjaan sebesar Rp 250.000 disetor langsung ke bank / penyelenggara oleh sekolah, tidak termasuk jumlah yang diterima.</w:t>
                   </w:r>
                 </w:p>
                 <w:p>
@@ -12675,7 +12660,7 @@
                       <w:sz w:val="18"/>
                       <w:szCs w:val="18"/>
                     </w:rPr>
-                    <w:t xml:space="preserve">DITERIMA GURU</w:t>
+                    <w:t xml:space="preserve">DITERIMA TUNAI OLEH GURU</w:t>
                   </w:r>
                 </w:p>
               </w:tc>
@@ -12888,21 +12873,6 @@
                       <w:szCs w:val="14"/>
                     </w:rPr>
                     <w:t xml:space="preserve">Catatan:</w:t>
-                  </w:r>
-                </w:p>
-                <w:p>
-                  <w:pPr>
-                    <w:spacing w:after="0" w:before="0" w:line="216"/>
-                    <w:jc w:val="left"/>
-                  </w:pPr>
-                  <w:r>
-                    <w:rPr>
-                      <w:rFonts w:ascii="Calibri" w:cs="Calibri" w:eastAsia="Calibri" w:hAnsi="Calibri"/>
-                      <w:color w:val="595959"/>
-                      <w:sz w:val="14"/>
-                      <w:szCs w:val="14"/>
-                    </w:rPr>
-                    <w:t xml:space="preserve">Tunjangan Kesehatan dan Ketenagakerjaan sebesar Rp 250.000 disetor langsung ke bank / penyelenggara oleh sekolah, tidak termasuk jumlah yang diterima.</w:t>
                   </w:r>
                 </w:p>
                 <w:p>

</xml_diff>